<commit_message>
Corrected Fransi salary numbers.
</commit_message>
<xml_diff>
--- a/Screw Drivers/Endbericht/Unterlagen/Sachbericht_Screw_Drivers_Entwurf.docx
+++ b/Screw Drivers/Endbericht/Unterlagen/Sachbericht_Screw_Drivers_Entwurf.docx
@@ -18,7 +18,15 @@
         <w:t>Projekt:</w:t>
       </w:r>
       <w:r>
-        <w:t xml:space="preserve"> Screw Drivers</w:t>
+        <w:t xml:space="preserve"> </w:t>
+      </w:r>
+      <w:proofErr w:type="spellStart"/>
+      <w:r>
+        <w:t>Screw</w:t>
+      </w:r>
+      <w:proofErr w:type="spellEnd"/>
+      <w:r>
+        <w:t xml:space="preserve"> Drivers</w:t>
       </w:r>
     </w:p>
     <w:p>
@@ -29,7 +37,23 @@
         <w:t>Förderempfänger:</w:t>
       </w:r>
       <w:r>
-        <w:t xml:space="preserve"> Creactstudios UG (haftungsbeschränkt), Bellensteinstraße 10, 77704 Oberkirch</w:t>
+        <w:t xml:space="preserve"> </w:t>
+      </w:r>
+      <w:proofErr w:type="spellStart"/>
+      <w:r>
+        <w:t>Creactstudios</w:t>
+      </w:r>
+      <w:proofErr w:type="spellEnd"/>
+      <w:r>
+        <w:t xml:space="preserve"> UG (haftungsbeschränkt), </w:t>
+      </w:r>
+      <w:proofErr w:type="spellStart"/>
+      <w:r>
+        <w:t>Bellensteinstraße</w:t>
+      </w:r>
+      <w:proofErr w:type="spellEnd"/>
+      <w:r>
+        <w:t xml:space="preserve"> 10, 77704 Oberkirch</w:t>
       </w:r>
     </w:p>
     <w:p>
@@ -131,72 +155,48 @@
         <w:rPr>
           <w:b/>
         </w:rPr>
-        <w:t>Be</w:t>
-      </w:r>
-      <w:r>
+        <w:t xml:space="preserve">Berichtsstichtag: </w:t>
+      </w:r>
+      <w:r>
+        <w:t>13</w:t>
+      </w:r>
+      <w:r>
+        <w:t>.0</w:t>
+      </w:r>
+      <w:r>
+        <w:t>9</w:t>
+      </w:r>
+      <w:r>
+        <w:t>.2026</w:t>
+      </w:r>
+    </w:p>
+    <w:p>
+      <w:pPr>
         <w:rPr>
           <w:b/>
         </w:rPr>
-        <w:t xml:space="preserve">richtsstichtag: </w:t>
-      </w:r>
-      <w:r>
-        <w:t>13</w:t>
-      </w:r>
-      <w:r>
-        <w:t>.0</w:t>
-      </w:r>
-      <w:r>
-        <w:t>9</w:t>
-      </w:r>
-      <w:r>
-        <w:t>.2026</w:t>
-      </w:r>
-    </w:p>
-    <w:p>
-      <w:pPr>
+      </w:pPr>
+      <w:r>
         <w:rPr>
           <w:b/>
         </w:rPr>
-      </w:pPr>
-      <w:r>
+        <w:t xml:space="preserve">Bericht erstellt von: </w:t>
+      </w:r>
+      <w:r>
+        <w:t>Marc Bendt</w:t>
+      </w:r>
+    </w:p>
+    <w:p>
+      <w:pPr>
         <w:rPr>
           <w:b/>
         </w:rPr>
-        <w:t>Berich</w:t>
-      </w:r>
+      </w:pPr>
       <w:r>
         <w:rPr>
           <w:b/>
         </w:rPr>
-        <w:t>t erstellt von</w:t>
-      </w:r>
-      <w:r>
-        <w:rPr>
-          <w:b/>
-        </w:rPr>
-        <w:t xml:space="preserve">: </w:t>
-      </w:r>
-      <w:r>
-        <w:t>Marc Bendt</w:t>
-      </w:r>
-    </w:p>
-    <w:p>
-      <w:pPr>
-        <w:rPr>
-          <w:b/>
-        </w:rPr>
-      </w:pPr>
-      <w:r>
-        <w:rPr>
-          <w:b/>
-        </w:rPr>
-        <w:t>Genre</w:t>
-      </w:r>
-      <w:r>
-        <w:rPr>
-          <w:b/>
-        </w:rPr>
-        <w:t xml:space="preserve">: </w:t>
+        <w:t xml:space="preserve">Genre: </w:t>
       </w:r>
       <w:r>
         <w:t>Rennspiel, Sandbox, Simulation</w:t>
@@ -207,7 +207,21 @@
         <w:rPr>
           <w:i/>
         </w:rPr>
-        <w:t>Der Soll-Stand ergibt sich aus dem Förderantrag (Antragsformular sowie Anlagen 2, 3, 8, 9 und 10, Stand 29./30.01.2025). Der Ist-Stand ergibt sich aus dem bisherigen Projektverlauf, der internen Dokumentation zur Liquiditäts- und Personalsteuerung sowie dem Finanzreport der Headup GmbH für das 2. Quartal 2026. Zahlen, die nicht belegt sind, sind als Platzhalter kenntlich gemacht. Die centgenaue Kosten- und Finanzierungsdarstellung bleibt den von Simon Blasen zu erstellenden Unterlagen Schlusskostenstand, Schlussfinanzierung und Einzelkostenliste vorbehalten.</w:t>
+        <w:t xml:space="preserve">Der Soll-Stand ergibt sich aus dem Förderantrag (Antragsformular sowie Anlagen 2, 3, 8, 9 und 10, Stand 29./30.01.2025). Der Ist-Stand ergibt sich aus dem bisherigen Projektverlauf, der internen Dokumentation zur Liquiditäts- und Personalsteuerung sowie dem Finanzreport der </w:t>
+      </w:r>
+      <w:proofErr w:type="spellStart"/>
+      <w:r>
+        <w:rPr>
+          <w:i/>
+        </w:rPr>
+        <w:t>Headup</w:t>
+      </w:r>
+      <w:proofErr w:type="spellEnd"/>
+      <w:r>
+        <w:rPr>
+          <w:i/>
+        </w:rPr>
+        <w:t xml:space="preserve"> GmbH für das 2. Quartal 2026. Zahlen, die nicht belegt sind, sind als Platzhalter kenntlich gemacht. Die centgenaue Kosten- und Finanzierungsdarstellung bleibt den von Simon Blasen zu erstellenden Unterlagen Schlusskostenstand, Schlussfinanzierung und Einzelkostenliste vorbehalten.</w:t>
       </w:r>
     </w:p>
     <w:p>
@@ -219,8 +233,21 @@
       </w:r>
     </w:p>
     <w:p>
-      <w:r>
-        <w:t>Screw Drivers ist ein digitales Renn-, Sandbox- und Simulationsspiel der Creactstudios UG (haftungsbeschränkt). Die Spielenden konstruieren Fahrzeuge in einem Bau-Editor, dessen Bauteile und Steckverbindungen an Technik-Baukastensysteme angelehnt sind. Antriebsstrang, Getriebe, Motoren und Fahrwerk werden von den Spielenden selbst zusammengesetzt. Das Spiel berechnet darauf aufbauend fahrphysikalische Größen (unter anderem Höchstgeschwindigkeit, Beschleunigung, Abtrieb und Schwerpunkt) und stellt die Konstruktionen in Karriere-Herausforderungen sowie im Mehrspieler-Modus auf die Probe.</w:t>
+      <w:proofErr w:type="spellStart"/>
+      <w:r>
+        <w:t>Screw</w:t>
+      </w:r>
+      <w:proofErr w:type="spellEnd"/>
+      <w:r>
+        <w:t xml:space="preserve"> Drivers ist ein digitales Renn-, Sandbox- und Simulationsspiel der </w:t>
+      </w:r>
+      <w:proofErr w:type="spellStart"/>
+      <w:r>
+        <w:t>Creactstudios</w:t>
+      </w:r>
+      <w:proofErr w:type="spellEnd"/>
+      <w:r>
+        <w:t xml:space="preserve"> UG (haftungsbeschränkt). Die Spielenden konstruieren Fahrzeuge in einem Bau-Editor, dessen Bauteile und Steckverbindungen an Technik-Baukastensysteme angelehnt sind. Antriebsstrang, Getriebe, Motoren und Fahrwerk werden von den Spielenden selbst zusammengesetzt. Das Spiel berechnet darauf aufbauend fahrphysikalische Größen (unter anderem Höchstgeschwindigkeit, Beschleunigung, Abtrieb und Schwerpunkt) und stellt die Konstruktionen in Karriere-Herausforderungen sowie im Mehrspieler-Modus auf die Probe.</w:t>
       </w:r>
     </w:p>
     <w:p>
@@ -258,7 +285,15 @@
         <w:t>Publisher:</w:t>
       </w:r>
       <w:r>
-        <w:t xml:space="preserve"> Headup GmbH, Düren.</w:t>
+        <w:t xml:space="preserve"> </w:t>
+      </w:r>
+      <w:proofErr w:type="spellStart"/>
+      <w:r>
+        <w:t>Headup</w:t>
+      </w:r>
+      <w:proofErr w:type="spellEnd"/>
+      <w:r>
+        <w:t xml:space="preserve"> GmbH, Düren.</w:t>
       </w:r>
     </w:p>
     <w:p>
@@ -269,7 +304,15 @@
         <w:t>Rechteinhaber / Entwickler:</w:t>
       </w:r>
       <w:r>
-        <w:t xml:space="preserve"> Creactstudios UG (haftungsbeschränkt).</w:t>
+        <w:t xml:space="preserve"> </w:t>
+      </w:r>
+      <w:proofErr w:type="spellStart"/>
+      <w:r>
+        <w:t>Creactstudios</w:t>
+      </w:r>
+      <w:proofErr w:type="spellEnd"/>
+      <w:r>
+        <w:t xml:space="preserve"> UG (haftungsbeschränkt).</w:t>
       </w:r>
     </w:p>
     <w:p>
@@ -281,7 +324,15 @@
         <w:t>Projektteam laut Antrag:</w:t>
       </w:r>
       <w:r>
-        <w:t xml:space="preserve"> Simon Blasen (Programmierung, Projektmanagement), Marc Bendt (Gamedesign, Sounddesign, Grafikdesign), Lucas Mößner / Skybound 3D (3D-Art, Environment Art).</w:t>
+        <w:t xml:space="preserve"> Simon Blasen (Programmierung, Projektmanagement), Marc Bendt (Gamedesign, Sounddesign, Grafikdesign), Lucas Mößner / </w:t>
+      </w:r>
+      <w:proofErr w:type="spellStart"/>
+      <w:r>
+        <w:t>Skybound</w:t>
+      </w:r>
+      <w:proofErr w:type="spellEnd"/>
+      <w:r>
+        <w:t xml:space="preserve"> 3D (3D-Art, Environment Art).</w:t>
       </w:r>
     </w:p>
     <w:p>
@@ -324,7 +375,23 @@
     </w:p>
     <w:p>
       <w:r>
-        <w:t>Die Produktionsarbeiten wurden zum 01.02.2025 aufgenommen. Marc Bendt war in diesem Zeitraum mit einem Beschäftigungsumfang von 80 % für Creactstudios tätig und arbeitete an Screw Drivers (Gamedesign, Sounddesign, Grafikdesign).</w:t>
+        <w:t xml:space="preserve">Die Produktionsarbeiten wurden zum 01.02.2025 aufgenommen. Marc Bendt war in diesem Zeitraum mit einem Beschäftigungsumfang von 80 % für </w:t>
+      </w:r>
+      <w:proofErr w:type="spellStart"/>
+      <w:r>
+        <w:t>Creactstudios</w:t>
+      </w:r>
+      <w:proofErr w:type="spellEnd"/>
+      <w:r>
+        <w:t xml:space="preserve"> tätig und arbeitete an </w:t>
+      </w:r>
+      <w:proofErr w:type="spellStart"/>
+      <w:r>
+        <w:t>Screw</w:t>
+      </w:r>
+      <w:proofErr w:type="spellEnd"/>
+      <w:r>
+        <w:t xml:space="preserve"> Drivers (Gamedesign, Sounddesign, Grafikdesign).</w:t>
       </w:r>
     </w:p>
     <w:p>
@@ -342,7 +409,15 @@
     </w:p>
     <w:p>
       <w:r>
-        <w:t>Im Zuge dieser Evaluation wurden DLCs und Ingame-Cosmetic-Items als zusätzliche Elemente in einem Free-Game-Modell erprobt. Die Resonanz blieb hinter den Erwartungen zurück. Dieses Monetarisierungsmodell wurde daher nicht weiterverfolgt. Ein im selben Zusammenhang evaluierter Character-Editor wurde gleichwohl als Teil der Spielerfahrung beibehalten und ausgebaut (vgl. Abschnitte 3.2 und 4.7).</w:t>
+        <w:t xml:space="preserve">Im Zuge dieser Evaluation wurden DLCs und Ingame-Cosmetic-Items als zusätzliche Elemente in einem Free-Game-Modell erprobt. Die Resonanz blieb hinter den Erwartungen zurück. Dieses </w:t>
+      </w:r>
+      <w:proofErr w:type="spellStart"/>
+      <w:r>
+        <w:t>Monetarisierungsmodell</w:t>
+      </w:r>
+      <w:proofErr w:type="spellEnd"/>
+      <w:r>
+        <w:t xml:space="preserve"> wurde daher nicht weiterverfolgt. Ein im selben Zusammenhang evaluierter Character-Editor wurde gleichwohl als Teil der Spielerfahrung beibehalten und ausgebaut (vgl. Abschnitte 3.2 und 4.7).</w:t>
       </w:r>
     </w:p>
     <w:p>
@@ -368,18 +443,58 @@
     </w:p>
     <w:p>
       <w:r>
-        <w:t>Im Zeitraum Juni 2025 bis September 2025 war Marc Bendt offiziell nicht bei der Creactstudios UG angestellt. Die im Antrag ihm zugeordneten Aufgaben Design, Art/Animation und Audio übernahm in dieser Phase Simon Blasen zusätzlich zur Programmierung. Das Projektmanagement war in diesem Zeitraum reduziert, weil die Firma personell im Wesentlichen von einer Person getragen wurde.</w:t>
-      </w:r>
-    </w:p>
-    <w:p>
-      <w:r>
-        <w:t>Am 02.06. und 03.06.2025 fanden zwei Konzepttage für ein anderes Vorhaben (Safety Game) statt. Im Übrigen lag der Arbeitsschwerpunkt von Simon Blasen weiterhin auf Screw Drivers.</w:t>
-      </w:r>
-    </w:p>
-    <w:p>
+        <w:t xml:space="preserve">Im Zeitraum Juni 2025 bis September 2025 war Marc Bendt offiziell nicht bei der </w:t>
+      </w:r>
+      <w:proofErr w:type="spellStart"/>
+      <w:r>
+        <w:t>Creactstudios</w:t>
+      </w:r>
+      <w:proofErr w:type="spellEnd"/>
+      <w:r>
+        <w:t xml:space="preserve"> UG angestellt. Die im Antrag ihm zugeordneten Aufgaben Design, Art/Animation und Audio übernahm in dieser Phase Simon Blasen zusätzlich zur Programmierung. Das Projektmanagement war in diesem Zeitraum reduziert, weil die Firma personell im Wesentlichen von einer Person getragen wurde.</w:t>
+      </w:r>
+    </w:p>
+    <w:p>
+      <w:r>
+        <w:t>Am 02.06. und 03.06.2025 fanden zwei Konzepttage für ein anderes Vorhaben (</w:t>
+      </w:r>
+      <w:proofErr w:type="spellStart"/>
+      <w:r>
+        <w:t>Safety</w:t>
+      </w:r>
+      <w:proofErr w:type="spellEnd"/>
+      <w:r>
+        <w:t xml:space="preserve"> Game) statt. Im Übrigen lag der Arbeitsschwerpunkt von Simon Blasen weiterhin auf </w:t>
+      </w:r>
+      <w:proofErr w:type="spellStart"/>
+      <w:r>
+        <w:t>Screw</w:t>
+      </w:r>
+      <w:proofErr w:type="spellEnd"/>
+      <w:r>
+        <w:t xml:space="preserve"> Drivers.</w:t>
+      </w:r>
+    </w:p>
+    <w:p>
+      <w:r>
+        <w:t>Die erste Förderrate ging im September 2025 ein. Parallel dazu wurden im Zeitraum September 2025 bis Februar 2026 Auftragsarbeiten angenommen, überwiegend durch Simon Blasen</w:t>
+      </w:r>
+      <w:r>
+        <w:t>.</w:t>
+      </w:r>
+    </w:p>
+    <w:p>
+      <w:pPr>
+        <w:pStyle w:val="berschrift3"/>
+      </w:pPr>
       <w:r>
         <w:lastRenderedPageBreak/>
-        <w:t>Die erste Förderrate ging im September 2025 ein. Parallel dazu wurden im Zeitraum September 2025 bis Februar 2026 Auftragsarbeiten angenommen, überwiegend durch Simon Blasen, um die Liquidität zu sichern.</w:t>
+        <w:t>2.5 Oktober 2025 bis Januar 2026 – Wiederanstellung Marc Bendt</w:t>
+      </w:r>
+    </w:p>
+    <w:p>
+      <w:r>
+        <w:t>Ab Oktober 2025 bis Januar 2026 war Marc Bendt erneut mit einem Umfang von 80 % angestellt und übernahm Design, Art/Animation und Audio wieder. Die Nachzahlung der in den Vormonaten nicht ausgekehrten Personalkosten an Simon Blasen begann (monatliche Auszahlung 7.500,00 € bei zugleich fortlaufender Projektarbeit).</w:t>
       </w:r>
     </w:p>
     <w:p>
@@ -387,12 +502,39 @@
         <w:pStyle w:val="berschrift3"/>
       </w:pPr>
       <w:r>
-        <w:t>2.5 Oktober 2025 bis Januar 2026 – Wiederanstellung Marc Bendt</w:t>
-      </w:r>
-    </w:p>
-    <w:p>
-      <w:r>
-        <w:t>Ab Oktober 2025 bis Januar 2026 war Marc Bendt erneut mit einem Umfang von 80 % angestellt und übernahm Design, Art/Animation und Audio wieder. Die Nachzahlung der in den Vormonaten nicht ausgekehrten Personalkosten an Simon Blasen begann (monatliche Auszahlung 7.500,00 € bei zugleich fortlaufender Projektarbeit).</w:t>
+        <w:t>2.6 Februar 2026 bis Release</w:t>
+      </w:r>
+    </w:p>
+    <w:p>
+      <w:r>
+        <w:t xml:space="preserve">Ab Februar 2026 war Marc Bendt nicht mehr angestellt. Design, Art/Animation und Audio lagen wieder bei Simon Blasen. Von Februar 2026 bis April 2026 bearbeitete Simon Blasen parallel eine Auftragsarbeit bei Weltenbauer. Das Projektmanagement blieb in der erneuten Ein-Personen-Phase zunächst reduziert und wurde </w:t>
+      </w:r>
+      <w:r>
+        <w:t>etwa ab Mai 2026 im Hinblick auf den anstehenden Release</w:t>
+      </w:r>
+      <w:r>
+        <w:t xml:space="preserve"> wieder verstärkt.</w:t>
+      </w:r>
+    </w:p>
+    <w:p>
+      <w:r>
+        <w:t xml:space="preserve">Seit Juli 2026 wurde eine neue Mitarbeiterin Fransiska Agustina eingestellt zur Unterstützung im Projekt </w:t>
+      </w:r>
+      <w:proofErr w:type="spellStart"/>
+      <w:r>
+        <w:t>Screw</w:t>
+      </w:r>
+      <w:proofErr w:type="spellEnd"/>
+      <w:r>
+        <w:t xml:space="preserve"> Drivers in den Bereichen Art und Design. Frau Agustina war ursprünglich nicht im Förderantrag vorgesehen. Ihre Hinzunahme zum Projekt im Rahmen der Förderung wurde von Yannick Wiesner schriftlich per E-Mail genehmigt.</w:t>
+      </w:r>
+    </w:p>
+    <w:p>
+      <w:r>
+        <w:t>Die Veröffentlichung erfolgte im August 2026 und damit rund zwölf Monate nach dem im Antrag genannten Termin 01.08.2025</w:t>
+      </w:r>
+      <w:r>
+        <w:t xml:space="preserve"> mit Steam als Vertriebsplattform.</w:t>
       </w:r>
     </w:p>
     <w:p>
@@ -400,33 +542,20 @@
         <w:pStyle w:val="berschrift3"/>
       </w:pPr>
       <w:r>
-        <w:t>2.6 Februar 2026 bis Release</w:t>
-      </w:r>
-    </w:p>
-    <w:p>
-      <w:r>
-        <w:t>Ab Februar 2026 war Marc Bendt nicht mehr angestellt. Design, Art/Animation und Audio lagen wieder bei Simon Blasen. Von Februar 2026 bis April 2026 bearbeitete Simon Blasen parallel eine Auftragsarbeit bei Weltenbauer. Das Projektmanagement blieb in der erneuten Ein-Personen-Phase zunächst reduziert und wurde zum Release im August 2026 wieder verstärkt.</w:t>
-      </w:r>
-    </w:p>
-    <w:p>
-      <w:r>
-        <w:t>Die Veröffentlichung erfolgte im August 2026 und damit rund zwölf Monate nach dem im Antrag genannten Termin 01.08.2025</w:t>
-      </w:r>
-      <w:r>
-        <w:t xml:space="preserve"> mit Steam als Vertriebsplattform.</w:t>
-      </w:r>
-    </w:p>
-    <w:p>
-      <w:pPr>
-        <w:pStyle w:val="berschrift3"/>
-      </w:pPr>
-      <w:r>
         <w:t>2.7 Verwertung (kurz, Stand Q2 2026)</w:t>
       </w:r>
     </w:p>
     <w:p>
       <w:r>
-        <w:t xml:space="preserve">Der Finanzreport der Headup GmbH zum Stichtag einschließlich Juni 2026 weist für das Projekt (dort bezeichnet als „Brumm Brumm“) Gesamterlöse von 42.241,45 € und auf Publisher-Seite ausgewiesene Kosten von 292.698,94 € aus. Der vertragliche Entwickleranteil beträgt 35 %. Bis zu diesem Stichtag wurde kein Share an das Studio ausgezahlt (0,00 €). Eine Tilgung des MFG-Darlehens aus Studioerlösen ist nach diesem Stand nicht erfolgt. </w:t>
+        <w:t xml:space="preserve">Der Finanzreport der </w:t>
+      </w:r>
+      <w:proofErr w:type="spellStart"/>
+      <w:r>
+        <w:t>Headup</w:t>
+      </w:r>
+      <w:proofErr w:type="spellEnd"/>
+      <w:r>
+        <w:t xml:space="preserve"> GmbH zum Stichtag einschließlich Juni 2026 weist für das Projekt (dort bezeichnet als „Brumm Brumm“) Gesamterlöse von 42.241,45 € und auf Publisher-Seite ausgewiesene Kosten von 292.698,94 € aus. Der vertragliche Entwickleranteil beträgt 35 %. Bis zu diesem Stichtag wurde kein Share an das Studio ausgezahlt (0,00 €). Eine Tilgung des MFG-Darlehens aus Studioerlösen ist nach diesem Stand nicht erfolgt. </w:t>
       </w:r>
     </w:p>
     <w:p>
@@ -600,10 +729,7 @@
               <w:t>Evaluation durchgeführt; DLC- und Cosmetic-Modell wegen unzureichender Resonanz nicht fortgeführt; Character-Editor als Spielinhalt beibehalten</w:t>
             </w:r>
             <w:r>
-              <w:t xml:space="preserve">. </w:t>
-            </w:r>
-            <w:r>
-              <w:t>(</w:t>
+              <w:t>. (</w:t>
             </w:r>
             <w:r>
               <w:rPr>
@@ -655,7 +781,11 @@
           </w:tcPr>
           <w:p>
             <w:r>
-              <w:t>Fortsetzung unter Liquiditätsenge (reduzierte Gehaltsauszahlung an Simon Blasen ab Mai 2025)</w:t>
+              <w:t xml:space="preserve">Fortsetzung unter Liquiditätsenge (reduzierte Gehaltsauszahlung an Simon Blasen ab Mai </w:t>
+            </w:r>
+            <w:r>
+              <w:lastRenderedPageBreak/>
+              <w:t>2025)</w:t>
             </w:r>
           </w:p>
         </w:tc>
@@ -665,6 +795,7 @@
           </w:tcPr>
           <w:p>
             <w:r>
+              <w:lastRenderedPageBreak/>
               <w:t>personelle und finanzielle Rahmenbedingungen abweichend</w:t>
             </w:r>
           </w:p>
@@ -677,9 +808,21 @@
           </w:tcPr>
           <w:p>
             <w:r>
-              <w:lastRenderedPageBreak/>
-              <w:t>Phase Playtest &amp; Polishing</w:t>
-            </w:r>
+              <w:t xml:space="preserve">Phase </w:t>
+            </w:r>
+            <w:proofErr w:type="spellStart"/>
+            <w:r>
+              <w:t>Playtest</w:t>
+            </w:r>
+            <w:proofErr w:type="spellEnd"/>
+            <w:r>
+              <w:t xml:space="preserve"> &amp; </w:t>
+            </w:r>
+            <w:proofErr w:type="spellStart"/>
+            <w:r>
+              <w:t>Polishing</w:t>
+            </w:r>
+            <w:proofErr w:type="spellEnd"/>
           </w:p>
         </w:tc>
         <w:tc>
@@ -701,10 +844,7 @@
               <w:t>Marc Bendt in diesem Zeitraum nicht angestellt; Aufgaben bei Simon Blasen gebündelt</w:t>
             </w:r>
             <w:r>
-              <w:t xml:space="preserve">. </w:t>
-            </w:r>
-            <w:r>
-              <w:t>(</w:t>
+              <w:t>. (</w:t>
             </w:r>
             <w:r>
               <w:rPr>
@@ -858,7 +998,19 @@
     </w:tbl>
     <w:p>
       <w:r>
-        <w:t>Die Ursache der Terminverschiebung liegt nicht in einer einmaligen technischen Störung, sondern in der Kombination aus verspätetem Mittelzufluss (erste Rate September 2025), vorübergehender Unterbrechung der Anstellung von Marc Bendt (Juni bis September 2025 sowie erneut ab Februar 2026) und der Notwendigkeit, in dieser Zeit Auftragsarbeiten zur Sicherung der Betriebsliquidität anzunehmen.</w:t>
+        <w:t xml:space="preserve">Die Ursache der Terminverschiebung liegt nicht in einer einmaligen technischen Störung, sondern in der Kombination aus verspätetem Mittelzufluss (erste Rate September 2025), vorübergehender Unterbrechung der Anstellung von Marc Bendt (Juni bis September 2025 sowie erneut ab Februar 2026) und der </w:t>
+      </w:r>
+      <w:r>
+        <w:t>Hinzunahme</w:t>
+      </w:r>
+      <w:r>
+        <w:t xml:space="preserve"> </w:t>
+      </w:r>
+      <w:r>
+        <w:t xml:space="preserve">von </w:t>
+      </w:r>
+      <w:r>
+        <w:t>Auftragsarbeiten.</w:t>
       </w:r>
     </w:p>
     <w:p>
@@ -939,7 +1091,15 @@
           </w:tcPr>
           <w:p>
             <w:r>
-              <w:t>Maps (Racetrack-Insel, Flugzeuge-Insel, Offroad-Insel)</w:t>
+              <w:t>Maps (</w:t>
+            </w:r>
+            <w:proofErr w:type="spellStart"/>
+            <w:r>
+              <w:t>Racetrack</w:t>
+            </w:r>
+            <w:proofErr w:type="spellEnd"/>
+            <w:r>
+              <w:t>-Insel, Flugzeuge-Insel, Offroad-Insel)</w:t>
             </w:r>
           </w:p>
         </w:tc>
@@ -965,7 +1125,21 @@
               <w:rPr>
                 <w:b/>
               </w:rPr>
-              <w:t>eine weitere Map zusätzlich</w:t>
+              <w:t xml:space="preserve">eine weitere </w:t>
+            </w:r>
+            <w:proofErr w:type="spellStart"/>
+            <w:r>
+              <w:rPr>
+                <w:b/>
+              </w:rPr>
+              <w:t>Map</w:t>
+            </w:r>
+            <w:proofErr w:type="spellEnd"/>
+            <w:r>
+              <w:rPr>
+                <w:b/>
+              </w:rPr>
+              <w:t xml:space="preserve"> zusätzlich</w:t>
             </w:r>
             <w:r>
               <w:rPr>
@@ -1033,10 +1207,7 @@
               <w:t>sämtliche im Antrag beschriebenen Bauteile bis zum Release eingefügt</w:t>
             </w:r>
             <w:r>
-              <w:t xml:space="preserve">. </w:t>
-            </w:r>
-            <w:r>
-              <w:t>(</w:t>
+              <w:t>. (</w:t>
             </w:r>
             <w:r>
               <w:rPr>
@@ -1058,7 +1229,15 @@
           </w:tcPr>
           <w:p>
             <w:r>
-              <w:t>Ingame-Features (Logik-System, Aerodynamik, Advanced Tutorials, Multiplayer-Ausbau)</w:t>
+              <w:t xml:space="preserve">Ingame-Features (Logik-System, Aerodynamik, </w:t>
+            </w:r>
+            <w:proofErr w:type="spellStart"/>
+            <w:r>
+              <w:t>Advanced</w:t>
+            </w:r>
+            <w:proofErr w:type="spellEnd"/>
+            <w:r>
+              <w:t xml:space="preserve"> Tutorials, Multiplayer-Ausbau)</w:t>
             </w:r>
           </w:p>
         </w:tc>
@@ -1081,10 +1260,7 @@
               <w:t>alle Ingame-Features wie geplant umgesetzt</w:t>
             </w:r>
             <w:r>
-              <w:t xml:space="preserve">. </w:t>
-            </w:r>
-            <w:r>
-              <w:t>(</w:t>
+              <w:t>. (</w:t>
             </w:r>
             <w:r>
               <w:rPr>
@@ -1106,7 +1282,31 @@
           </w:tcPr>
           <w:p>
             <w:r>
-              <w:t>Weiteres (Lokalisation, Karriere-Balancing, Playtesting, Polishing, Soundtrack-Ausbau, Controller-Support)</w:t>
+              <w:t>Weiteres (Lokalisation, Karriere-</w:t>
+            </w:r>
+            <w:proofErr w:type="spellStart"/>
+            <w:r>
+              <w:t>Balancing</w:t>
+            </w:r>
+            <w:proofErr w:type="spellEnd"/>
+            <w:r>
+              <w:t xml:space="preserve">, </w:t>
+            </w:r>
+            <w:proofErr w:type="spellStart"/>
+            <w:r>
+              <w:t>Playtesting</w:t>
+            </w:r>
+            <w:proofErr w:type="spellEnd"/>
+            <w:r>
+              <w:t xml:space="preserve">, </w:t>
+            </w:r>
+            <w:proofErr w:type="spellStart"/>
+            <w:r>
+              <w:t>Polishing</w:t>
+            </w:r>
+            <w:proofErr w:type="spellEnd"/>
+            <w:r>
+              <w:t>, Soundtrack-Ausbau, Controller-Support)</w:t>
             </w:r>
           </w:p>
         </w:tc>
@@ -1129,10 +1329,7 @@
               <w:t>vollständig eingebaut</w:t>
             </w:r>
             <w:r>
-              <w:t xml:space="preserve">. </w:t>
-            </w:r>
-            <w:r>
-              <w:t>(</w:t>
+              <w:t>. (</w:t>
             </w:r>
             <w:r>
               <w:rPr>
@@ -1183,10 +1380,7 @@
               <w:t xml:space="preserve"> umgesetzt; großes neues Feature zur Unterscheidung von Early Access und Release</w:t>
             </w:r>
             <w:r>
-              <w:t xml:space="preserve">. </w:t>
-            </w:r>
-            <w:r>
-              <w:t>(</w:t>
+              <w:t>. (</w:t>
             </w:r>
             <w:r>
               <w:rPr>
@@ -1218,7 +1412,19 @@
           </w:tcPr>
           <w:p>
             <w:r>
-              <w:t>im Rahmen der Monetarisierungs-Evaluation vorgesehen</w:t>
+              <w:t xml:space="preserve">im Rahmen der </w:t>
+            </w:r>
+            <w:proofErr w:type="spellStart"/>
+            <w:r>
+              <w:t>Monetarisierungs</w:t>
+            </w:r>
+            <w:proofErr w:type="spellEnd"/>
+            <w:r>
+              <w:t>-</w:t>
+            </w:r>
+            <w:r>
+              <w:lastRenderedPageBreak/>
+              <w:t>Evaluation vorgesehen</w:t>
             </w:r>
           </w:p>
         </w:tc>
@@ -1228,6 +1434,7 @@
           </w:tcPr>
           <w:p>
             <w:r>
+              <w:lastRenderedPageBreak/>
               <w:t xml:space="preserve">nach unzureichendem Umsatz </w:t>
             </w:r>
             <w:proofErr w:type="gramStart"/>
@@ -1242,11 +1449,16 @@
             </w:r>
             <w:proofErr w:type="gramEnd"/>
             <w:r>
-              <w:t xml:space="preserve"> als Monetarisierungsmodell </w:t>
-            </w:r>
+              <w:t xml:space="preserve"> als </w:t>
+            </w:r>
+            <w:proofErr w:type="spellStart"/>
             <w:r>
               <w:lastRenderedPageBreak/>
-              <w:t xml:space="preserve">fortgeführt, jedoch für die Spielerfahrung </w:t>
+              <w:t>Monetarisierungsmodell</w:t>
+            </w:r>
+            <w:proofErr w:type="spellEnd"/>
+            <w:r>
+              <w:t xml:space="preserve"> fortgeführt, jedoch für die Spielerfahrung </w:t>
             </w:r>
             <w:r>
               <w:rPr>
@@ -1280,12 +1492,28 @@
     <w:p>
       <w:r>
         <w:lastRenderedPageBreak/>
-        <w:t>Über den Antrag hinaus wurden somit eine weitere Map und ein Strecken-Editor realisiert. Der beantragte inhaltliche Leistungsumfang der Maps, Bauteile, Ingame-Features und der Position „Weiteres“ ist zum Release erreicht.</w:t>
-      </w:r>
-    </w:p>
-    <w:p>
-      <w:r>
-        <w:t>Organisatorische Abweichungen gegenüber dem Antrag (nicht der Featureliste):</w:t>
+        <w:t xml:space="preserve">Über den Antrag hinaus wurden somit eine weitere </w:t>
+      </w:r>
+      <w:proofErr w:type="spellStart"/>
+      <w:r>
+        <w:t>Map</w:t>
+      </w:r>
+      <w:proofErr w:type="spellEnd"/>
+      <w:r>
+        <w:t xml:space="preserve"> und ein Strecken-Editor realisiert. Der beantragte inhaltliche Leistungsumfang der Maps, Bauteile, Ingame-Features und der Position „Weiteres“ ist zum Release erreicht.</w:t>
+      </w:r>
+    </w:p>
+    <w:p>
+      <w:r>
+        <w:t xml:space="preserve">Organisatorische Abweichungen gegenüber dem Antrag (nicht der </w:t>
+      </w:r>
+      <w:proofErr w:type="spellStart"/>
+      <w:r>
+        <w:t>Featureliste</w:t>
+      </w:r>
+      <w:proofErr w:type="spellEnd"/>
+      <w:r>
+        <w:t>):</w:t>
       </w:r>
     </w:p>
     <w:p>
@@ -1334,7 +1562,15 @@
         <w:ind w:left="360"/>
       </w:pPr>
       <w:r>
-        <w:t>-     Das im Antrag evaluierte Monetarisierungsmodell über DLCs und Ingame-Cosmetic-Items in einem Free Game wurde nach unzureichender Resonanz nicht weiterverfolgt (vgl. Abschnitt 4.7).</w:t>
+        <w:t xml:space="preserve">-     Das im Antrag evaluierte </w:t>
+      </w:r>
+      <w:proofErr w:type="spellStart"/>
+      <w:r>
+        <w:t>Monetarisierungsmodell</w:t>
+      </w:r>
+      <w:proofErr w:type="spellEnd"/>
+      <w:r>
+        <w:t xml:space="preserve"> über DLCs und Ingame-Cosmetic-Items in einem Free Game wurde nach unzureichender Resonanz nicht weiterverfolgt (vgl. Abschnitt 4.7).</w:t>
       </w:r>
     </w:p>
     <w:p>
@@ -1442,7 +1678,13 @@
           </w:tcPr>
           <w:p>
             <w:r>
-              <w:t>60.922,00€</w:t>
+              <w:t>60.922,</w:t>
+            </w:r>
+            <w:r>
+              <w:t>49</w:t>
+            </w:r>
+            <w:r>
+              <w:t>€</w:t>
             </w:r>
           </w:p>
         </w:tc>
@@ -1452,7 +1694,13 @@
           </w:tcPr>
           <w:p>
             <w:r>
-              <w:t>10.702,00 €</w:t>
+              <w:t>10.702,</w:t>
+            </w:r>
+            <w:r>
+              <w:t>49</w:t>
+            </w:r>
+            <w:r>
+              <w:t xml:space="preserve"> €</w:t>
             </w:r>
           </w:p>
         </w:tc>
@@ -1484,7 +1732,19 @@
           </w:tcPr>
           <w:p>
             <w:r>
-              <w:t>12.194,00€</w:t>
+              <w:t>12.1</w:t>
+            </w:r>
+            <w:r>
+              <w:t>37</w:t>
+            </w:r>
+            <w:r>
+              <w:t>,</w:t>
+            </w:r>
+            <w:r>
+              <w:t>53</w:t>
+            </w:r>
+            <w:r>
+              <w:t>€</w:t>
             </w:r>
           </w:p>
         </w:tc>
@@ -1494,7 +1754,19 @@
           </w:tcPr>
           <w:p>
             <w:r>
-              <w:t>-406,00 €</w:t>
+              <w:t>-4</w:t>
+            </w:r>
+            <w:r>
+              <w:t>62</w:t>
+            </w:r>
+            <w:r>
+              <w:t>,</w:t>
+            </w:r>
+            <w:r>
+              <w:t>47</w:t>
+            </w:r>
+            <w:r>
+              <w:t xml:space="preserve"> €</w:t>
             </w:r>
           </w:p>
         </w:tc>
@@ -1526,7 +1798,19 @@
           </w:tcPr>
           <w:p>
             <w:r>
-              <w:t>7.181,00€</w:t>
+              <w:t>7.</w:t>
+            </w:r>
+            <w:r>
+              <w:t>060</w:t>
+            </w:r>
+            <w:r>
+              <w:t>,</w:t>
+            </w:r>
+            <w:r>
+              <w:t>45</w:t>
+            </w:r>
+            <w:r>
+              <w:t>€</w:t>
             </w:r>
           </w:p>
         </w:tc>
@@ -1536,7 +1820,19 @@
           </w:tcPr>
           <w:p>
             <w:r>
-              <w:t>-379,00 €</w:t>
+              <w:t>-</w:t>
+            </w:r>
+            <w:r>
+              <w:t>499</w:t>
+            </w:r>
+            <w:r>
+              <w:t>,</w:t>
+            </w:r>
+            <w:r>
+              <w:t>55</w:t>
+            </w:r>
+            <w:r>
+              <w:t xml:space="preserve"> €</w:t>
             </w:r>
           </w:p>
         </w:tc>
@@ -1568,7 +1864,19 @@
           </w:tcPr>
           <w:p>
             <w:r>
-              <w:t>28.783,00€</w:t>
+              <w:t>28.</w:t>
+            </w:r>
+            <w:r>
+              <w:t>518</w:t>
+            </w:r>
+            <w:r>
+              <w:t>,</w:t>
+            </w:r>
+            <w:r>
+              <w:t>28</w:t>
+            </w:r>
+            <w:r>
+              <w:t>€</w:t>
             </w:r>
           </w:p>
         </w:tc>
@@ -1578,7 +1886,19 @@
           </w:tcPr>
           <w:p>
             <w:r>
-              <w:t>3.583,00 €</w:t>
+              <w:t>3.</w:t>
+            </w:r>
+            <w:r>
+              <w:t>318</w:t>
+            </w:r>
+            <w:r>
+              <w:t>,</w:t>
+            </w:r>
+            <w:r>
+              <w:t>28</w:t>
+            </w:r>
+            <w:r>
+              <w:t xml:space="preserve"> €</w:t>
             </w:r>
           </w:p>
         </w:tc>
@@ -1613,7 +1933,10 @@
               <w:t>10.567</w:t>
             </w:r>
             <w:r>
-              <w:t>,00</w:t>
+              <w:t>,</w:t>
+            </w:r>
+            <w:r>
+              <w:t>26</w:t>
             </w:r>
             <w:r>
               <w:t>€</w:t>
@@ -1626,7 +1949,19 @@
           </w:tcPr>
           <w:p>
             <w:r>
-              <w:t>-1.313,00 €</w:t>
+              <w:t>-1.31</w:t>
+            </w:r>
+            <w:r>
+              <w:t>2</w:t>
+            </w:r>
+            <w:r>
+              <w:t>,</w:t>
+            </w:r>
+            <w:r>
+              <w:t>74</w:t>
+            </w:r>
+            <w:r>
+              <w:t xml:space="preserve"> €</w:t>
             </w:r>
           </w:p>
         </w:tc>
@@ -1658,7 +1993,10 @@
           </w:tcPr>
           <w:p>
             <w:r>
-              <w:t>21.975</w:t>
+              <w:t>21.</w:t>
+            </w:r>
+            <w:r>
+              <w:t>600</w:t>
             </w:r>
             <w:r>
               <w:t>,00</w:t>
@@ -1674,7 +2012,10 @@
           </w:tcPr>
           <w:p>
             <w:r>
-              <w:t>375,00 €</w:t>
+              <w:t>0</w:t>
+            </w:r>
+            <w:r>
+              <w:t>,00 €</w:t>
             </w:r>
           </w:p>
         </w:tc>
@@ -1706,7 +2047,25 @@
           </w:tcPr>
           <w:p>
             <w:r>
-              <w:t>141.622,00 €</w:t>
+              <w:t>14</w:t>
+            </w:r>
+            <w:r>
+              <w:t>0</w:t>
+            </w:r>
+            <w:r>
+              <w:t>.</w:t>
+            </w:r>
+            <w:r>
+              <w:t>806</w:t>
+            </w:r>
+            <w:r>
+              <w:t>,</w:t>
+            </w:r>
+            <w:r>
+              <w:t>01</w:t>
+            </w:r>
+            <w:r>
+              <w:t xml:space="preserve"> €</w:t>
             </w:r>
           </w:p>
         </w:tc>
@@ -1716,7 +2075,28 @@
           </w:tcPr>
           <w:p>
             <w:r>
-              <w:t>12.562,00 €</w:t>
+              <w:t>1</w:t>
+            </w:r>
+            <w:r>
+              <w:t>1</w:t>
+            </w:r>
+            <w:r>
+              <w:t>.</w:t>
+            </w:r>
+            <w:r>
+              <w:t>7</w:t>
+            </w:r>
+            <w:r>
+              <w:t>46</w:t>
+            </w:r>
+            <w:r>
+              <w:t>,0</w:t>
+            </w:r>
+            <w:r>
+              <w:t>1</w:t>
+            </w:r>
+            <w:r>
+              <w:t xml:space="preserve"> €</w:t>
             </w:r>
           </w:p>
         </w:tc>
@@ -1846,7 +2226,43 @@
               <w:rPr>
                 <w:b/>
               </w:rPr>
-              <w:t>148.045,35 €</w:t>
+              <w:t>1</w:t>
+            </w:r>
+            <w:r>
+              <w:rPr>
+                <w:b/>
+              </w:rPr>
+              <w:t>47</w:t>
+            </w:r>
+            <w:r>
+              <w:rPr>
+                <w:b/>
+              </w:rPr>
+              <w:t>.</w:t>
+            </w:r>
+            <w:r>
+              <w:rPr>
+                <w:b/>
+              </w:rPr>
+              <w:t>229</w:t>
+            </w:r>
+            <w:r>
+              <w:rPr>
+                <w:b/>
+              </w:rPr>
+              <w:t>,</w:t>
+            </w:r>
+            <w:r>
+              <w:rPr>
+                <w:b/>
+              </w:rPr>
+              <w:t>35</w:t>
+            </w:r>
+            <w:r>
+              <w:rPr>
+                <w:b/>
+              </w:rPr>
+              <w:t xml:space="preserve"> €</w:t>
             </w:r>
           </w:p>
         </w:tc>
@@ -1864,7 +2280,49 @@
               <w:rPr>
                 <w:b/>
               </w:rPr>
-              <w:t>12.562,00 €</w:t>
+              <w:t>1</w:t>
+            </w:r>
+            <w:r>
+              <w:rPr>
+                <w:b/>
+              </w:rPr>
+              <w:t>1</w:t>
+            </w:r>
+            <w:r>
+              <w:rPr>
+                <w:b/>
+              </w:rPr>
+              <w:t>.</w:t>
+            </w:r>
+            <w:r>
+              <w:rPr>
+                <w:b/>
+              </w:rPr>
+              <w:t>7</w:t>
+            </w:r>
+            <w:r>
+              <w:rPr>
+                <w:b/>
+              </w:rPr>
+              <w:t>46</w:t>
+            </w:r>
+            <w:r>
+              <w:rPr>
+                <w:b/>
+              </w:rPr>
+              <w:t>,</w:t>
+            </w:r>
+            <w:r>
+              <w:rPr>
+                <w:b/>
+              </w:rPr>
+              <w:t>00</w:t>
+            </w:r>
+            <w:r>
+              <w:rPr>
+                <w:b/>
+              </w:rPr>
+              <w:t xml:space="preserve"> €</w:t>
             </w:r>
           </w:p>
         </w:tc>
@@ -1896,10 +2354,28 @@
           </w:tcPr>
           <w:p>
             <w:r>
-              <w:rPr>
-                <w:highlight w:val="yellow"/>
-              </w:rPr>
-              <w:t>[PLATZHALTER]</w:t>
+              <w:t>14</w:t>
+            </w:r>
+            <w:r>
+              <w:t>0</w:t>
+            </w:r>
+            <w:r>
+              <w:t>.</w:t>
+            </w:r>
+            <w:r>
+              <w:t>806</w:t>
+            </w:r>
+            <w:r>
+              <w:t>,</w:t>
+            </w:r>
+            <w:r>
+              <w:t>0</w:t>
+            </w:r>
+            <w:r>
+              <w:t>1</w:t>
+            </w:r>
+            <w:r>
+              <w:t xml:space="preserve"> €</w:t>
             </w:r>
           </w:p>
         </w:tc>
@@ -1909,10 +2385,25 @@
           </w:tcPr>
           <w:p>
             <w:r>
-              <w:rPr>
-                <w:highlight w:val="yellow"/>
-              </w:rPr>
-              <w:t>[PLATZHALTER]</w:t>
+              <w:t>7</w:t>
+            </w:r>
+            <w:r>
+              <w:t>.</w:t>
+            </w:r>
+            <w:r>
+              <w:t>355</w:t>
+            </w:r>
+            <w:r>
+              <w:t>,</w:t>
+            </w:r>
+            <w:r>
+              <w:t>0</w:t>
+            </w:r>
+            <w:r>
+              <w:t>1</w:t>
+            </w:r>
+            <w:r>
+              <w:t xml:space="preserve"> €</w:t>
             </w:r>
           </w:p>
         </w:tc>
@@ -1925,11 +2416,8 @@
     </w:p>
     <w:p>
       <w:r>
-        <w:t xml:space="preserve">Die Ist-Beträge der Einzelpositionen Programmierung, Art/Animation intern, Audio, Design, Projektmanagement, Outsourcing Art/Animation sowie Handlungskosten und PwC-Prüfgebühr entstammen </w:t>
-      </w:r>
-      <w:r>
         <w:lastRenderedPageBreak/>
-        <w:t>der internen Kostenaufstellung. Die Fertigungskosten (Ist) sind die Summe der sechs Fertigungspositionen. Die Gesamtherstellungskosten (Ist) sind die Summe aus Fertigungskosten, Handlungskosten und PwC-Prüfgebühr. Die Spalte Differenz weist jeweils Ist minus Soll aus. Der Baden-Württemberg-Effekt lässt sich aus diesen Kostenpositionen nicht ableiten und bleibt offen</w:t>
+        <w:t>Die Ist-Beträge der Einzelpositionen Programmierung, Art/Animation intern, Audio, Design, Projektmanagement, Outsourcing Art/Animation sowie Handlungskosten und PwC-Prüfgebühr entstammen der internen Kostenaufstellung. Die Fertigungskosten (Ist) sind die Summe der sechs Fertigungspositionen. Die Gesamtherstellungskosten (Ist) sind die Summe aus Fertigungskosten, Handlungskosten und PwC-Prüfgebühr. Die Spalte Differenz weist jeweils Ist minus Soll aus. Der Baden-Württemberg-Effekt lässt sich aus diesen Kostenpositionen nicht ableiten und bleibt offen</w:t>
       </w:r>
     </w:p>
     <w:p>
@@ -2030,7 +2518,19 @@
           </w:tcPr>
           <w:p>
             <w:r>
-              <w:t>58.549,13</w:t>
+              <w:t>60</w:t>
+            </w:r>
+            <w:r>
+              <w:t>.</w:t>
+            </w:r>
+            <w:r>
+              <w:t>967</w:t>
+            </w:r>
+            <w:r>
+              <w:t>,</w:t>
+            </w:r>
+            <w:r>
+              <w:t>51</w:t>
             </w:r>
             <w:r>
               <w:t xml:space="preserve"> </w:t>
@@ -2048,7 +2548,15 @@
           </w:tcPr>
           <w:p>
             <w:r>
-              <w:t>Darlehen Headup GmbH</w:t>
+              <w:t xml:space="preserve">Darlehen </w:t>
+            </w:r>
+            <w:proofErr w:type="spellStart"/>
+            <w:r>
+              <w:t>Headup</w:t>
+            </w:r>
+            <w:proofErr w:type="spellEnd"/>
+            <w:r>
+              <w:t xml:space="preserve"> GmbH</w:t>
             </w:r>
           </w:p>
         </w:tc>
@@ -2148,7 +2656,49 @@
                 <w:b/>
                 <w:bCs/>
               </w:rPr>
-              <w:t>126.290,8 €</w:t>
+              <w:t>12</w:t>
+            </w:r>
+            <w:r>
+              <w:rPr>
+                <w:b/>
+                <w:bCs/>
+              </w:rPr>
+              <w:t>8</w:t>
+            </w:r>
+            <w:r>
+              <w:rPr>
+                <w:b/>
+                <w:bCs/>
+              </w:rPr>
+              <w:t>.</w:t>
+            </w:r>
+            <w:r>
+              <w:rPr>
+                <w:b/>
+                <w:bCs/>
+              </w:rPr>
+              <w:t>709</w:t>
+            </w:r>
+            <w:r>
+              <w:rPr>
+                <w:b/>
+                <w:bCs/>
+              </w:rPr>
+              <w:t>,</w:t>
+            </w:r>
+            <w:r>
+              <w:rPr>
+                <w:b/>
+                <w:bCs/>
+              </w:rPr>
+              <w:t>18</w:t>
+            </w:r>
+            <w:r>
+              <w:rPr>
+                <w:b/>
+                <w:bCs/>
+              </w:rPr>
+              <w:t xml:space="preserve"> €</w:t>
             </w:r>
           </w:p>
         </w:tc>
@@ -2162,16 +2712,40 @@
         <w:t xml:space="preserve">. </w:t>
       </w:r>
       <w:r>
-        <w:t>Rate 1: 31.452,46€. Rate 2: 27.096,67€</w:t>
-      </w:r>
-      <w:r>
-        <w:t>4.</w:t>
+        <w:t>Rate 1: 3</w:t>
+      </w:r>
+      <w:r>
+        <w:t>3</w:t>
+      </w:r>
+      <w:r>
+        <w:t>.</w:t>
+      </w:r>
+      <w:r>
+        <w:t>838,59</w:t>
+      </w:r>
+      <w:r>
+        <w:t>€. Rate 2: 27.096,67€</w:t>
+      </w:r>
+      <w:r>
+        <w:t>.</w:t>
       </w:r>
       <w:r>
         <w:t xml:space="preserve"> Offene Schlussrate: </w:t>
       </w:r>
       <w:r>
-        <w:t>9.192,55</w:t>
+        <w:t>6</w:t>
+      </w:r>
+      <w:r>
+        <w:t>.</w:t>
+      </w:r>
+      <w:r>
+        <w:t>774</w:t>
+      </w:r>
+      <w:r>
+        <w:t>,</w:t>
+      </w:r>
+      <w:r>
+        <w:t>17</w:t>
       </w:r>
       <w:r>
         <w:t>€.</w:t>
@@ -2227,7 +2801,39 @@
         <w:t>Unterbrochene Personalkapazität.</w:t>
       </w:r>
       <w:r>
-        <w:t xml:space="preserve"> Marc Bendt war von Juni 2025 bis September 2025 nicht angestellt. Die im Antrag für Playtest, Polishing und den Übergang zur Veröffentlichung vorgesehene Doppelbesetzung entfiel in genau der Phase, in der laut Projektplan Playtest und Polishing (01.06.2025–31.07.2025) sowie anschließend die Veröffentlichung (01.08.2025) liegen sollten.</w:t>
+        <w:t xml:space="preserve"> Marc Bendt war von Juni 2025 bis September 2025 nicht angestellt. Die im Antrag für </w:t>
+      </w:r>
+      <w:proofErr w:type="spellStart"/>
+      <w:r>
+        <w:t>Playtest</w:t>
+      </w:r>
+      <w:proofErr w:type="spellEnd"/>
+      <w:r>
+        <w:t xml:space="preserve">, </w:t>
+      </w:r>
+      <w:proofErr w:type="spellStart"/>
+      <w:r>
+        <w:t>Polishing</w:t>
+      </w:r>
+      <w:proofErr w:type="spellEnd"/>
+      <w:r>
+        <w:t xml:space="preserve"> und den Übergang zur Veröffentlichung vorgesehene Doppelbesetzung entfiel in genau der Phase, in der laut Projektplan </w:t>
+      </w:r>
+      <w:proofErr w:type="spellStart"/>
+      <w:r>
+        <w:t>Playtest</w:t>
+      </w:r>
+      <w:proofErr w:type="spellEnd"/>
+      <w:r>
+        <w:t xml:space="preserve"> und </w:t>
+      </w:r>
+      <w:proofErr w:type="spellStart"/>
+      <w:r>
+        <w:t>Polishing</w:t>
+      </w:r>
+      <w:proofErr w:type="spellEnd"/>
+      <w:r>
+        <w:t xml:space="preserve"> (01.06.2025–31.07.2025) sowie anschließend die Veröffentlichung (01.08.2025) liegen sollten.</w:t>
       </w:r>
     </w:p>
     <w:p>
@@ -2244,7 +2850,15 @@
         <w:t>Auftragsarbeiten zur Liquiditätssicherung.</w:t>
       </w:r>
       <w:r>
-        <w:t xml:space="preserve"> Von September 2025 bis Februar 2026 und zusätzlich von Februar 2026 bis April 2026 (Weltenbauer) wurden Kapazitäten parallel in Auftragsprojekten gebunden. Dadurch stand weniger kontinuierliche Kapazität für Screw Drivers zur Verfügung, als im Antrag unterstellt.</w:t>
+        <w:t xml:space="preserve"> Von September 2025 bis Februar 2026 und zusätzlich von Februar 2026 bis April 2026 (Weltenbauer) wurden Kapazitäten parallel in Auftragsprojekten gebunden. Dadurch stand weniger kontinuierliche Kapazität für </w:t>
+      </w:r>
+      <w:proofErr w:type="spellStart"/>
+      <w:r>
+        <w:t>Screw</w:t>
+      </w:r>
+      <w:proofErr w:type="spellEnd"/>
+      <w:r>
+        <w:t xml:space="preserve"> Drivers zur Verfügung, als im Antrag unterstellt.</w:t>
       </w:r>
     </w:p>
     <w:p>
@@ -2279,6 +2893,7 @@
         </w:numPr>
       </w:pPr>
       <w:r>
+        <w:lastRenderedPageBreak/>
         <w:t>Juni 2025 bis September 2025: Marc Bendt nicht angestellt. Simon Blasen übernahm Design, Art/Animation und Audio zusätzlich zur Programmierung.</w:t>
       </w:r>
     </w:p>
@@ -2291,7 +2906,6 @@
         </w:numPr>
       </w:pPr>
       <w:r>
-        <w:lastRenderedPageBreak/>
         <w:t>Oktober 2025 bis Januar 2026: Marc Bendt wieder angestellt (80 %); die genannten Aufgaben gingen an ihn zurück.</w:t>
       </w:r>
     </w:p>
@@ -2305,6 +2919,18 @@
       </w:pPr>
       <w:r>
         <w:t>Ab Februar 2026: Marc Bendt nicht mehr angestellt; die Aufgaben lagen erneut bei Simon Blasen.</w:t>
+      </w:r>
+    </w:p>
+    <w:p>
+      <w:pPr>
+        <w:pStyle w:val="Aufzhlungszeichen"/>
+        <w:numPr>
+          <w:ilvl w:val="0"/>
+          <w:numId w:val="3"/>
+        </w:numPr>
+      </w:pPr>
+      <w:r>
+        <w:t>Ab Juli 2026: Fransiska Agustina eingestellt und zum geförderten Projekt hinzugenommen zur Unterstützung des Releases.</w:t>
       </w:r>
     </w:p>
     <w:p>
@@ -2688,13 +3314,7 @@
     </w:p>
     <w:p>
       <w:r>
-        <w:t xml:space="preserve">Für den Verwendungsnachweis ist maßgeblich, dass die Kosten der Maßnahme zuzuordnen und nach Nachholung tatsächlich abgeflossen sind. Leistungszeitraum und Zahlungszeitraum fallen auseinander. Die Einzelkostenliste hat dies je Monat und Person kenntlich zu machen (Projektanteil, Leistungszeitraum, Zahlungsdatum). </w:t>
-      </w:r>
-      <w:r>
-        <w:rPr>
-          <w:highlight w:val="yellow"/>
-        </w:rPr>
-        <w:t>[PLATZHALTER: Abgleich mit Belegliste.]</w:t>
+        <w:t>Für den Verwendungsnachweis ist maßgeblich, dass die Kosten der Maßnahme zuzuordnen und nach Nachholung tatsächlich abgeflossen sind. Leistungszeitraum und Zahlungszeitraum fallen auseinander. Die Einzelkostenliste hat dies je Monat und Person kenntlich zu machen (Projektanteil, Leistungszeitraum, Zahlungsdatum).</w:t>
       </w:r>
     </w:p>
     <w:p>
@@ -2707,6 +3327,7 @@
         <w:pStyle w:val="berschrift3"/>
       </w:pPr>
       <w:r>
+        <w:lastRenderedPageBreak/>
         <w:t>4.5 Auftragsarbeiten außerhalb der geförderten Maßnahme</w:t>
       </w:r>
     </w:p>
@@ -2714,9 +3335,13 @@
       <w:r>
         <w:t xml:space="preserve">Im Zeitraum September 2025 bis Februar 2026 wurden Auftragsarbeiten angenommen, überwiegend durch Simon Blasen. Von Februar 2026 bis April 2026 kam eine Auftragsarbeit bei Weltenbauer hinzu. Diese Tätigkeiten dienten der Betriebsliquidität. Sie sind nicht Gegenstand der geförderten Herstellungskosten von </w:t>
       </w:r>
-      <w:r>
-        <w:lastRenderedPageBreak/>
-        <w:t>Screw Drivers und dürfen in der Belegliste nicht als förderfähige Kosten der Maßnahme erscheinen. Soweit Arbeitszeit auf Auftragsprojekte entfiel, ist sie in der Zeiterfassung als Projektarbeit (P) bzw. außerhalb der SD-Stunden geführt.</w:t>
+      <w:proofErr w:type="spellStart"/>
+      <w:r>
+        <w:t>Screw</w:t>
+      </w:r>
+      <w:proofErr w:type="spellEnd"/>
+      <w:r>
+        <w:t xml:space="preserve"> Drivers und dürfen in der Belegliste nicht als förderfähige Kosten der Maßnahme erscheinen. Soweit Arbeitszeit auf Auftragsprojekte entfiel, ist sie in der Zeiterfassung als Projektarbeit (P) bzw. außerhalb der SD-Stunden geführt.</w:t>
       </w:r>
     </w:p>
     <w:p/>
@@ -2935,7 +3560,39 @@
         <w:t>Maps, Bauteile, Features:</w:t>
       </w:r>
       <w:r>
-        <w:t xml:space="preserve"> Alle im Antrag (Anlage 2, Teil 2 b) beschriebenen Maps, Bauteile und Ingame-Features wurden umgesetzt, ebenso die Position „Weiteres“ (Lokalisation, Karriere-Balancing, Playtesting, Polishing, Soundtrack-Ausbau, Controller-Support). Zusätzlich wurde eine weitere Map erstellt. Als neues, im Antrag nicht als Förderelement ausgewiesenes Feature wurde ein Strecken-Editor implementiert. Er soll Early Access und Release voneinander abgrenzen.</w:t>
+        <w:t xml:space="preserve"> Alle im Antrag (Anlage 2, Teil 2 b) beschriebenen Maps, Bauteile und Ingame-Features wurden umgesetzt, ebenso die Position „Weiteres“ (Lokalisation, Karriere-</w:t>
+      </w:r>
+      <w:proofErr w:type="spellStart"/>
+      <w:r>
+        <w:t>Balancing</w:t>
+      </w:r>
+      <w:proofErr w:type="spellEnd"/>
+      <w:r>
+        <w:t xml:space="preserve">, </w:t>
+      </w:r>
+      <w:proofErr w:type="spellStart"/>
+      <w:r>
+        <w:t>Playtesting</w:t>
+      </w:r>
+      <w:proofErr w:type="spellEnd"/>
+      <w:r>
+        <w:t xml:space="preserve">, </w:t>
+      </w:r>
+      <w:proofErr w:type="spellStart"/>
+      <w:r>
+        <w:t>Polishing</w:t>
+      </w:r>
+      <w:proofErr w:type="spellEnd"/>
+      <w:r>
+        <w:t xml:space="preserve">, Soundtrack-Ausbau, Controller-Support). Zusätzlich wurde eine weitere </w:t>
+      </w:r>
+      <w:proofErr w:type="spellStart"/>
+      <w:r>
+        <w:t>Map</w:t>
+      </w:r>
+      <w:proofErr w:type="spellEnd"/>
+      <w:r>
+        <w:t xml:space="preserve"> erstellt. Als neues, im Antrag nicht als Förderelement ausgewiesenes Feature wurde ein Strecken-Editor implementiert. Er soll Early Access und Release voneinander abgrenzen.</w:t>
       </w:r>
     </w:p>
     <w:p>
@@ -2946,7 +3603,15 @@
         <w:t>Monetarisierung:</w:t>
       </w:r>
       <w:r>
-        <w:t xml:space="preserve"> Im geplanten Evaluationszeitraum wurden DLCs und Ingame-Cosmetic-Items als zusätzliche Elemente in einem Free-Game-Modell erprobt. Der Anklang blieb hinter den Erwartungen zurück. Dieses Monetarisierungsmodell wurde deshalb nicht weiterverfolgt. Es handelt sich um eine bewusste Abkehr auf Grundlage der beobachteten Resonanz, nicht um eine unvollständige Umsetzung der übrigen Produktionsinhalte.</w:t>
+        <w:t xml:space="preserve"> Im geplanten Evaluationszeitraum wurden DLCs und Ingame-Cosmetic-Items als zusätzliche Elemente in einem Free-Game-Modell erprobt. Der Anklang blieb hinter den Erwartungen zurück. Dieses </w:t>
+      </w:r>
+      <w:proofErr w:type="spellStart"/>
+      <w:r>
+        <w:t>Monetarisierungsmodell</w:t>
+      </w:r>
+      <w:proofErr w:type="spellEnd"/>
+      <w:r>
+        <w:t xml:space="preserve"> wurde deshalb nicht weiterverfolgt. Es handelt sich um eine bewusste Abkehr auf Grundlage der beobachteten Resonanz, nicht um eine unvollständige Umsetzung der übrigen Produktionsinhalte.</w:t>
       </w:r>
     </w:p>
     <w:p>
@@ -2957,18 +3622,15 @@
         <w:t>Character-Editor:</w:t>
       </w:r>
       <w:r>
-        <w:t xml:space="preserve"> Der im Zuge der Monetarisierungs-Evaluation vorgesehene Character-Editor erzielte keinen ausreichenden Umsatz. Er wurde dennoch nicht entfernt, sondern als Bestandteil der Spielerfahrung beibehalten und ausgebaut.</w:t>
-      </w:r>
-    </w:p>
-    <w:p>
-      <w:r>
-        <w:rPr>
-          <w:b/>
-        </w:rPr>
-        <w:t>Vertrieb:</w:t>
-      </w:r>
-      <w:r>
-        <w:t xml:space="preserve"> Das Spiel wurde am 20.08.2026 ausschließlich über Steam (PC) veröffentlicht. Eine Veröffentlichung auf Konsolen (PlayStation, Xbox, Nintendo Switch) ist nicht erfolgt. Konsolenports liegen optional in der Zukunft.</w:t>
+        <w:t xml:space="preserve"> Der im Zuge der </w:t>
+      </w:r>
+      <w:proofErr w:type="spellStart"/>
+      <w:r>
+        <w:t>Monetarisierungs</w:t>
+      </w:r>
+      <w:proofErr w:type="spellEnd"/>
+      <w:r>
+        <w:t>-Evaluation vorgesehene Character-Editor erzielte keinen ausreichenden Umsatz. Er wurde dennoch nicht entfernt, sondern als Bestandteil der Spielerfahrung beibehalten und ausgebaut.</w:t>
       </w:r>
     </w:p>
     <w:p>
@@ -2977,6 +3639,25 @@
           <w:b/>
         </w:rPr>
         <w:lastRenderedPageBreak/>
+        <w:t>Vertrieb:</w:t>
+      </w:r>
+      <w:r>
+        <w:t xml:space="preserve"> Das Spiel wurde am 20.08.2026 ausschließlich über Steam (PC) veröffentlicht. Eine Veröffentlichung auf Konsolen (PlayStation, Xbox, Nintendo Switch) ist nicht erfolgt. </w:t>
+      </w:r>
+      <w:proofErr w:type="spellStart"/>
+      <w:r>
+        <w:t>Konsolenports</w:t>
+      </w:r>
+      <w:proofErr w:type="spellEnd"/>
+      <w:r>
+        <w:t xml:space="preserve"> liegen optional in der Zukunft.</w:t>
+      </w:r>
+    </w:p>
+    <w:p>
+      <w:r>
+        <w:rPr>
+          <w:b/>
+        </w:rPr>
         <w:t>Sprachen:</w:t>
       </w:r>
       <w:r>
@@ -3047,8 +3728,18 @@
                 <w:b/>
                 <w:sz w:val="20"/>
               </w:rPr>
-              <w:t xml:space="preserve">  ohne Vollton</w:t>
-            </w:r>
+              <w:t xml:space="preserve">  ohne </w:t>
+            </w:r>
+            <w:proofErr w:type="spellStart"/>
+            <w:r>
+              <w:rPr>
+                <w:rFonts w:cs="Calibri"/>
+                <w:b/>
+                <w:sz w:val="20"/>
+              </w:rPr>
+              <w:t>Vollton</w:t>
+            </w:r>
+            <w:proofErr w:type="spellEnd"/>
           </w:p>
         </w:tc>
       </w:tr>
@@ -3765,8 +4456,21 @@
       </w:r>
     </w:p>
     <w:p>
-      <w:r>
-        <w:t xml:space="preserve">Credits zur Förderung der MfG sind unter dem „Credits“ Knopf im </w:t>
+      <w:proofErr w:type="spellStart"/>
+      <w:r>
+        <w:t>Credits</w:t>
+      </w:r>
+      <w:proofErr w:type="spellEnd"/>
+      <w:r>
+        <w:t xml:space="preserve"> zur Förderung der MfG sind unter dem „</w:t>
+      </w:r>
+      <w:proofErr w:type="spellStart"/>
+      <w:r>
+        <w:t>Credits</w:t>
+      </w:r>
+      <w:proofErr w:type="spellEnd"/>
+      <w:r>
+        <w:t xml:space="preserve">“ Knopf im </w:t>
       </w:r>
       <w:r>
         <w:t>Hauptmenü zu finden:</w:t>
@@ -3819,10 +4523,26 @@
         <w:t xml:space="preserve">KI-Tools wurden lediglich als Unterstützung in der Programmierung verwendet. Dabei handelte es sich um gängige Hilf-Tools wie </w:t>
       </w:r>
       <w:r>
-        <w:t>Code Completion / Inline-Generierung</w:t>
-      </w:r>
-      <w:r>
-        <w:t xml:space="preserve"> oder Code-Parsing. In Art, Design, Audio, Projektmanagement wurden keine KI-Tools verwendet.</w:t>
+        <w:t xml:space="preserve">Code </w:t>
+      </w:r>
+      <w:proofErr w:type="spellStart"/>
+      <w:r>
+        <w:t>Completion</w:t>
+      </w:r>
+      <w:proofErr w:type="spellEnd"/>
+      <w:r>
+        <w:t xml:space="preserve"> / Inline-Generierung</w:t>
+      </w:r>
+      <w:r>
+        <w:t xml:space="preserve"> oder Code-</w:t>
+      </w:r>
+      <w:proofErr w:type="spellStart"/>
+      <w:r>
+        <w:t>Parsing</w:t>
+      </w:r>
+      <w:proofErr w:type="spellEnd"/>
+      <w:r>
+        <w:t>. In Art, Design, Audio, Projektmanagement wurden keine KI-Tools verwendet.</w:t>
       </w:r>
     </w:p>
     <w:p>
@@ -3840,12 +4560,39 @@
     </w:p>
     <w:p>
       <w:r>
-        <w:t>Die geförderte Produktionsmaßnahme wurde begonnen und zu einem veröffentlichten Spielstand geführt. Der inhaltliche Kern (fahrzeugphysikalisch gerechneter Bau-Editor, Karriere- und Mehrspieler-Rahmen, Publisher Headup GmbH) entspricht dem Antrag. Die in Anlage 2 Teil 2 b genannten Maps, Bauteile, Ingame-Features und sonstigen Produktionselemente wurden umgesetzt; zusätzlich entstanden eine weitere Map und ein Strecken-Editor. Ein Monetarisierungsmodell über DLCs und Cosmetic Items in einem Free Game wurde nach unzureichender Resonanz nicht fortgeführt; der Character-Editor blieb als Spielinhalt erhalten.</w:t>
-      </w:r>
-    </w:p>
-    <w:p>
+        <w:t xml:space="preserve">Die geförderte Produktionsmaßnahme wurde begonnen und zu einem veröffentlichten Spielstand geführt. Der inhaltliche Kern (fahrzeugphysikalisch gerechneter Bau-Editor, Karriere- und Mehrspieler-Rahmen, Publisher </w:t>
+      </w:r>
+      <w:proofErr w:type="spellStart"/>
+      <w:r>
+        <w:t>Headup</w:t>
+      </w:r>
+      <w:proofErr w:type="spellEnd"/>
+      <w:r>
+        <w:t xml:space="preserve"> GmbH) entspricht dem Antrag. Die in Anlage 2 Teil 2 b genannten Maps, Bauteile, Ingame-Features und sonstigen Produktionselemente wurden umgesetzt; zusätzlich entstanden eine </w:t>
+      </w:r>
       <w:r>
         <w:lastRenderedPageBreak/>
+        <w:t xml:space="preserve">weitere </w:t>
+      </w:r>
+      <w:proofErr w:type="spellStart"/>
+      <w:r>
+        <w:t>Map</w:t>
+      </w:r>
+      <w:proofErr w:type="spellEnd"/>
+      <w:r>
+        <w:t xml:space="preserve"> und ein Strecken-Editor. Ein </w:t>
+      </w:r>
+      <w:proofErr w:type="spellStart"/>
+      <w:r>
+        <w:t>Monetarisierungsmodell</w:t>
+      </w:r>
+      <w:proofErr w:type="spellEnd"/>
+      <w:r>
+        <w:t xml:space="preserve"> über DLCs und Cosmetic Items in einem Free Game wurde nach unzureichender Resonanz nicht fortgeführt; der Character-Editor blieb als Spielinhalt erhalten.</w:t>
+      </w:r>
+    </w:p>
+    <w:p>
+      <w:r>
         <w:t>Der zeitliche Rahmen des Antrags (Release 01.08.2025, Maßnahmenende 31.10.2025) wurde nicht eingehalten. Ursächlich sind der späte Zufluss der ersten Förderrate, die vorübergehende Unterbrechung der Anstellung von Marc Bendt und die Parallelität von Auftragsarbeiten zur Liquiditätssicherung.</w:t>
       </w:r>
     </w:p>
@@ -3862,7 +4609,15 @@
     </w:p>
     <w:p>
       <w:r>
-        <w:t>Die Verwertung ist aufgenommen. Zum Stichtag des Headup-Reports (einschließlich Juni 2026) liegen Publisher-Erlöse von 42.241,45 € vor; ein Entwickler-Share wurde nicht ausgezahlt. Eine Darlehenstilgung an die MFG ist auf dieser Grundlage noch nicht erfolgt. Die weitere Auswertung obliegt dem Publisher</w:t>
+        <w:t xml:space="preserve">Die Verwertung ist aufgenommen. Zum Stichtag des </w:t>
+      </w:r>
+      <w:proofErr w:type="spellStart"/>
+      <w:r>
+        <w:t>Headup</w:t>
+      </w:r>
+      <w:proofErr w:type="spellEnd"/>
+      <w:r>
+        <w:t>-Reports (einschließlich Juni 2026) liegen Publisher-Erlöse von 42.241,45 € vor; ein Entwickler-Share wurde nicht ausgezahlt. Eine Darlehenstilgung an die MFG ist auf dieser Grundlage noch nicht erfolgt. Die weitere Auswertung obliegt dem Publisher</w:t>
       </w:r>
       <w:r>
         <w:t>.</w:t>
@@ -3875,7 +4630,15 @@
         <w:t>D</w:t>
       </w:r>
       <w:r>
-        <w:t>er 1. Auswertungsbericht stellt den Recoupment-Stand gesondert dar.</w:t>
+        <w:t xml:space="preserve">er 1. Auswertungsbericht stellt den </w:t>
+      </w:r>
+      <w:proofErr w:type="spellStart"/>
+      <w:r>
+        <w:t>Recoupment</w:t>
+      </w:r>
+      <w:proofErr w:type="spellEnd"/>
+      <w:r>
+        <w:t>-Stand gesondert dar.</w:t>
       </w:r>
     </w:p>
     <w:p>

</xml_diff>